<commit_message>
Update code for sample_thread and logging_thread
</commit_message>
<xml_diff>
--- a/Đánh giá kết quả.docx
+++ b/Đánh giá kết quả.docx
@@ -30,12 +30,11 @@
       <w:r>
         <w:rPr>
           <w:rFonts w:ascii="Times New Roman" w:hAnsi="Times New Roman" w:cs="Times New Roman"/>
-          <w:noProof/>
         </w:rPr>
         <w:drawing>
-          <wp:inline distT="0" distB="0" distL="0" distR="0" wp14:anchorId="2832C4AD" wp14:editId="731D6312">
-            <wp:extent cx="4716780" cy="4019342"/>
-            <wp:effectExtent l="0" t="0" r="7620" b="635"/>
+          <wp:inline distT="0" distB="0" distL="0" distR="0" wp14:anchorId="334B318A" wp14:editId="49C01932">
+            <wp:extent cx="4785360" cy="3596943"/>
+            <wp:effectExtent l="0" t="0" r="0" b="3810"/>
             <wp:docPr id="1" name="Picture 1"/>
             <wp:cNvGraphicFramePr>
               <a:graphicFrameLocks xmlns:a="http://schemas.openxmlformats.org/drawingml/2006/main" noChangeAspect="1"/>
@@ -56,7 +55,7 @@
                   <pic:spPr>
                     <a:xfrm>
                       <a:off x="0" y="0"/>
-                      <a:ext cx="4739190" cy="4038438"/>
+                      <a:ext cx="4799506" cy="3607576"/>
                     </a:xfrm>
                     <a:prstGeom prst="rect">
                       <a:avLst/>
@@ -85,86 +84,37 @@
     </w:p>
     <w:p>
       <w:pPr>
-        <w:rPr>
-          <w:rFonts w:ascii="Times New Roman" w:hAnsi="Times New Roman" w:cs="Times New Roman"/>
-        </w:rPr>
-      </w:pPr>
-      <w:r>
-        <w:rPr>
-          <w:rFonts w:ascii="Times New Roman" w:hAnsi="Times New Roman" w:cs="Times New Roman"/>
-        </w:rPr>
-        <w:t>Đánh giá:</w:t>
-      </w:r>
-      <w:r>
-        <w:rPr>
-          <w:rFonts w:ascii="Times New Roman" w:hAnsi="Times New Roman" w:cs="Times New Roman"/>
-        </w:rPr>
-        <w:t xml:space="preserve"> </w:t>
-      </w:r>
-    </w:p>
-    <w:p>
-      <w:pPr>
-        <w:rPr>
-          <w:rFonts w:ascii="Times New Roman" w:hAnsi="Times New Roman" w:cs="Times New Roman"/>
-        </w:rPr>
-      </w:pPr>
-      <w:r>
-        <w:rPr>
-          <w:rFonts w:ascii="Times New Roman" w:hAnsi="Times New Roman" w:cs="Times New Roman"/>
-        </w:rPr>
-        <w:t xml:space="preserve">- </w:t>
-      </w:r>
-      <w:r>
-        <w:rPr>
-          <w:rFonts w:ascii="Times New Roman" w:hAnsi="Times New Roman" w:cs="Times New Roman"/>
-        </w:rPr>
-        <w:t>Biểu đồ cho thấy đã có gốc giá trị Interval đạt đúng 10^6(ns), tuy nhiên sai số vẫn xảy ra và có thể đạt tới giá trị 2x10^6(ns) và nhỏ hơn.</w:t>
-      </w:r>
-    </w:p>
-    <w:p>
-      <w:pPr>
-        <w:rPr>
-          <w:rFonts w:ascii="Times New Roman" w:hAnsi="Times New Roman" w:cs="Times New Roman"/>
-        </w:rPr>
-      </w:pPr>
-      <w:r>
-        <w:rPr>
-          <w:rFonts w:ascii="Times New Roman" w:hAnsi="Times New Roman" w:cs="Times New Roman"/>
-        </w:rPr>
-        <w:t xml:space="preserve">- Điều này xảy ra có thể là do </w:t>
-      </w:r>
-      <w:r>
-        <w:rPr>
-          <w:rFonts w:ascii="Times New Roman" w:hAnsi="Times New Roman" w:cs="Times New Roman"/>
-        </w:rPr>
-        <w:t>việc dùng mutex để b</w:t>
-      </w:r>
-      <w:bookmarkStart w:id="0" w:name="_GoBack"/>
-      <w:bookmarkEnd w:id="0"/>
-      <w:r>
-        <w:rPr>
-          <w:rFonts w:ascii="Times New Roman" w:hAnsi="Times New Roman" w:cs="Times New Roman"/>
-        </w:rPr>
-        <w:t>ảo vệ tài nguyên dùng chung và đảm bảo sự đồng bộ nhất quán của hệ thống, làm cho thread cần hoạt động thì lại phải chờ thread khác nhả lock ra để được thực hiện thuật toán của mình.</w:t>
-      </w:r>
-    </w:p>
-    <w:p>
-      <w:pPr>
-        <w:jc w:val="center"/>
-        <w:rPr>
-          <w:rFonts w:ascii="Times New Roman" w:hAnsi="Times New Roman" w:cs="Times New Roman"/>
-        </w:rPr>
-      </w:pPr>
-      <w:r>
-        <w:rPr>
-          <w:rFonts w:ascii="Times New Roman" w:hAnsi="Times New Roman" w:cs="Times New Roman"/>
-          <w:noProof/>
-        </w:rPr>
+        <w:jc w:val="center"/>
+        <w:rPr>
+          <w:rFonts w:ascii="Times New Roman" w:hAnsi="Times New Roman" w:cs="Times New Roman"/>
+        </w:rPr>
+      </w:pPr>
+    </w:p>
+    <w:p>
+      <w:pPr>
+        <w:jc w:val="center"/>
+        <w:rPr>
+          <w:rFonts w:ascii="Times New Roman" w:hAnsi="Times New Roman" w:cs="Times New Roman"/>
+        </w:rPr>
+      </w:pPr>
+    </w:p>
+    <w:p>
+      <w:pPr>
+        <w:jc w:val="center"/>
+        <w:rPr>
+          <w:rFonts w:ascii="Times New Roman" w:hAnsi="Times New Roman" w:cs="Times New Roman"/>
+        </w:rPr>
+      </w:pPr>
+      <w:r>
+        <w:rPr>
+          <w:rFonts w:ascii="Times New Roman" w:hAnsi="Times New Roman" w:cs="Times New Roman"/>
+        </w:rPr>
+        <w:lastRenderedPageBreak/>
         <w:drawing>
-          <wp:inline distT="0" distB="0" distL="0" distR="0" wp14:anchorId="6F4E6722" wp14:editId="0CB6C07C">
-            <wp:extent cx="2827020" cy="2153666"/>
-            <wp:effectExtent l="0" t="0" r="0" b="0"/>
-            <wp:docPr id="2" name="Picture 2"/>
+          <wp:inline distT="0" distB="0" distL="0" distR="0" wp14:anchorId="1E55B403" wp14:editId="1CE289CD">
+            <wp:extent cx="5067300" cy="3899216"/>
+            <wp:effectExtent l="0" t="0" r="0" b="6350"/>
+            <wp:docPr id="3" name="Picture 3"/>
             <wp:cNvGraphicFramePr>
               <a:graphicFrameLocks xmlns:a="http://schemas.openxmlformats.org/drawingml/2006/main" noChangeAspect="1"/>
             </wp:cNvGraphicFramePr>
@@ -184,7 +134,7 @@
                   <pic:spPr>
                     <a:xfrm>
                       <a:off x="0" y="0"/>
-                      <a:ext cx="2848953" cy="2170375"/>
+                      <a:ext cx="5074136" cy="3904476"/>
                     </a:xfrm>
                     <a:prstGeom prst="rect">
                       <a:avLst/>
@@ -204,24 +154,36 @@
           <w:rFonts w:ascii="Times New Roman" w:hAnsi="Times New Roman" w:cs="Times New Roman"/>
         </w:rPr>
       </w:pPr>
-    </w:p>
-    <w:p>
-      <w:pPr>
-        <w:rPr>
-          <w:rFonts w:ascii="Times New Roman" w:hAnsi="Times New Roman" w:cs="Times New Roman"/>
-        </w:rPr>
-      </w:pPr>
-      <w:r>
-        <w:rPr>
-          <w:rFonts w:ascii="Times New Roman" w:hAnsi="Times New Roman" w:cs="Times New Roman"/>
-          <w:noProof/>
-        </w:rPr>
-        <w:lastRenderedPageBreak/>
+      <w:r>
+        <w:rPr>
+          <w:rFonts w:ascii="Times New Roman" w:hAnsi="Times New Roman" w:cs="Times New Roman"/>
+        </w:rPr>
+        <w:t>Biểu đồ giá trị Interval với chu kỳ X = 10^5(ns)</w:t>
+      </w:r>
+    </w:p>
+    <w:p>
+      <w:pPr>
+        <w:rPr>
+          <w:rFonts w:ascii="Times New Roman" w:hAnsi="Times New Roman" w:cs="Times New Roman"/>
+        </w:rPr>
+      </w:pPr>
+    </w:p>
+    <w:p>
+      <w:pPr>
+        <w:jc w:val="center"/>
+        <w:rPr>
+          <w:rFonts w:ascii="Times New Roman" w:hAnsi="Times New Roman" w:cs="Times New Roman"/>
+        </w:rPr>
+      </w:pPr>
+      <w:r>
+        <w:rPr>
+          <w:rFonts w:ascii="Times New Roman" w:hAnsi="Times New Roman" w:cs="Times New Roman"/>
+        </w:rPr>
         <w:drawing>
-          <wp:inline distT="0" distB="0" distL="0" distR="0" wp14:anchorId="6BAA68D5" wp14:editId="790D0F5C">
-            <wp:extent cx="5421028" cy="4617720"/>
-            <wp:effectExtent l="0" t="0" r="8255" b="0"/>
-            <wp:docPr id="7" name="Picture 7"/>
+          <wp:inline distT="0" distB="0" distL="0" distR="0" wp14:anchorId="61D01D78" wp14:editId="121DE872">
+            <wp:extent cx="4015740" cy="3021811"/>
+            <wp:effectExtent l="0" t="0" r="3810" b="7620"/>
+            <wp:docPr id="4" name="Picture 4"/>
             <wp:cNvGraphicFramePr>
               <a:graphicFrameLocks xmlns:a="http://schemas.openxmlformats.org/drawingml/2006/main" noChangeAspect="1"/>
             </wp:cNvGraphicFramePr>
@@ -241,7 +203,7 @@
                   <pic:spPr>
                     <a:xfrm>
                       <a:off x="0" y="0"/>
-                      <a:ext cx="5425369" cy="4621418"/>
+                      <a:ext cx="4024754" cy="3028594"/>
                     </a:xfrm>
                     <a:prstGeom prst="rect">
                       <a:avLst/>
@@ -265,78 +227,26 @@
         <w:rPr>
           <w:rFonts w:ascii="Times New Roman" w:hAnsi="Times New Roman" w:cs="Times New Roman"/>
         </w:rPr>
-        <w:t>Biểu đồ giá trị Interval với chu kỳ X = 10^5(ns)</w:t>
-      </w:r>
-    </w:p>
-    <w:p>
-      <w:pPr>
-        <w:rPr>
-          <w:rFonts w:ascii="Times New Roman" w:hAnsi="Times New Roman" w:cs="Times New Roman"/>
-        </w:rPr>
-      </w:pPr>
-    </w:p>
-    <w:p>
-      <w:pPr>
-        <w:rPr>
-          <w:rFonts w:ascii="Times New Roman" w:hAnsi="Times New Roman" w:cs="Times New Roman"/>
-        </w:rPr>
-      </w:pPr>
-      <w:r>
-        <w:rPr>
-          <w:rFonts w:ascii="Times New Roman" w:hAnsi="Times New Roman" w:cs="Times New Roman"/>
-        </w:rPr>
-        <w:t>Đánh giá:</w:t>
-      </w:r>
-      <w:r>
-        <w:rPr>
-          <w:rFonts w:ascii="Times New Roman" w:hAnsi="Times New Roman" w:cs="Times New Roman"/>
-        </w:rPr>
-        <w:t xml:space="preserve"> Nhìn vào đồ thị ta nhận thấy có 2 khoảng giá trị phổ biến đó là </w:t>
-      </w:r>
-      <w:r>
-        <w:rPr>
-          <w:rFonts w:ascii="Times New Roman" w:hAnsi="Times New Roman" w:cs="Times New Roman"/>
-        </w:rPr>
-        <w:t xml:space="preserve">đỉnh </w:t>
-      </w:r>
-      <w:r>
-        <w:rPr>
-          <w:rFonts w:ascii="Times New Roman" w:hAnsi="Times New Roman" w:cs="Times New Roman"/>
-        </w:rPr>
-        <w:t xml:space="preserve">1.2x10^6(ns) và </w:t>
-      </w:r>
-      <w:r>
-        <w:rPr>
-          <w:rFonts w:ascii="Times New Roman" w:hAnsi="Times New Roman" w:cs="Times New Roman"/>
-        </w:rPr>
-        <w:t xml:space="preserve">đáy 0.4x10^6(ns). Đồng thời các giá trị đỉnh 1.2x10^6(ns) chiếm phần đa giá trị. Từ đó cho thấy với chu kỳ </w:t>
-      </w:r>
-      <w:r>
-        <w:rPr>
-          <w:rFonts w:ascii="Times New Roman" w:hAnsi="Times New Roman" w:cs="Times New Roman"/>
-        </w:rPr>
-        <w:br/>
-        <w:t>X = 10^5(ns) thì giá trị các interval không khớp chút nào. Tuy nhiên các giá trị đỉnh khá ổn định.</w:t>
-      </w:r>
-    </w:p>
-    <w:p>
-      <w:pPr>
-        <w:jc w:val="center"/>
-        <w:rPr>
-          <w:rFonts w:ascii="Times New Roman" w:hAnsi="Times New Roman" w:cs="Times New Roman"/>
-        </w:rPr>
-      </w:pPr>
-      <w:r>
-        <w:rPr>
-          <w:rFonts w:ascii="Times New Roman" w:hAnsi="Times New Roman" w:cs="Times New Roman"/>
-          <w:noProof/>
+        <w:t>Biểu đồ giá trị Interval với chu kỳ X = 10^4(ns)</w:t>
+      </w:r>
+    </w:p>
+    <w:p>
+      <w:pPr>
+        <w:jc w:val="center"/>
+        <w:rPr>
+          <w:rFonts w:ascii="Times New Roman" w:hAnsi="Times New Roman" w:cs="Times New Roman"/>
+        </w:rPr>
+      </w:pPr>
+      <w:r>
+        <w:rPr>
+          <w:rFonts w:ascii="Times New Roman" w:hAnsi="Times New Roman" w:cs="Times New Roman"/>
         </w:rPr>
         <w:lastRenderedPageBreak/>
         <w:drawing>
-          <wp:inline distT="0" distB="0" distL="0" distR="0" wp14:anchorId="17FAB013" wp14:editId="451C1EC3">
-            <wp:extent cx="4236720" cy="3627918"/>
-            <wp:effectExtent l="0" t="0" r="0" b="0"/>
-            <wp:docPr id="8" name="Picture 8"/>
+          <wp:inline distT="0" distB="0" distL="0" distR="0" wp14:anchorId="3B181F1D" wp14:editId="50AA5E8C">
+            <wp:extent cx="4434840" cy="3256607"/>
+            <wp:effectExtent l="0" t="0" r="3810" b="1270"/>
+            <wp:docPr id="5" name="Picture 5"/>
             <wp:cNvGraphicFramePr>
               <a:graphicFrameLocks xmlns:a="http://schemas.openxmlformats.org/drawingml/2006/main" noChangeAspect="1"/>
             </wp:cNvGraphicFramePr>
@@ -356,7 +266,7 @@
                   <pic:spPr>
                     <a:xfrm>
                       <a:off x="0" y="0"/>
-                      <a:ext cx="4249556" cy="3638909"/>
+                      <a:ext cx="4452819" cy="3269809"/>
                     </a:xfrm>
                     <a:prstGeom prst="rect">
                       <a:avLst/>
@@ -380,94 +290,25 @@
         <w:rPr>
           <w:rFonts w:ascii="Times New Roman" w:hAnsi="Times New Roman" w:cs="Times New Roman"/>
         </w:rPr>
-        <w:t>Biểu đồ giá trị Interval với chu kỳ X = 10^4(ns)</w:t>
-      </w:r>
-    </w:p>
-    <w:p>
-      <w:pPr>
-        <w:rPr>
-          <w:rFonts w:ascii="Times New Roman" w:hAnsi="Times New Roman" w:cs="Times New Roman"/>
-        </w:rPr>
-      </w:pPr>
-      <w:r>
-        <w:rPr>
-          <w:rFonts w:ascii="Times New Roman" w:hAnsi="Times New Roman" w:cs="Times New Roman"/>
-        </w:rPr>
-        <w:t>Đánh giá:</w:t>
-      </w:r>
-      <w:r>
-        <w:rPr>
-          <w:rFonts w:ascii="Times New Roman" w:hAnsi="Times New Roman" w:cs="Times New Roman"/>
-        </w:rPr>
-        <w:t xml:space="preserve"> Nhìn vào đồ thị ta nhận thấy ngay các giá trị của interval khá ổn định và đạt giá trị</w:t>
-      </w:r>
-      <w:r>
-        <w:rPr>
-          <w:rFonts w:ascii="Times New Roman" w:hAnsi="Times New Roman" w:cs="Times New Roman"/>
-        </w:rPr>
-        <w:t xml:space="preserve"> 1.1</w:t>
-      </w:r>
-      <w:r>
-        <w:rPr>
-          <w:rFonts w:ascii="Times New Roman" w:hAnsi="Times New Roman" w:cs="Times New Roman"/>
-        </w:rPr>
-        <w:t>x10^6(ns), mặc dù có đáy với giá trị 0.3x10^6(ns)</w:t>
-      </w:r>
-      <w:r>
-        <w:rPr>
-          <w:rFonts w:ascii="Times New Roman" w:hAnsi="Times New Roman" w:cs="Times New Roman"/>
-        </w:rPr>
-        <w:t xml:space="preserve"> và có một vài</w:t>
-      </w:r>
-      <w:r>
-        <w:rPr>
-          <w:rFonts w:ascii="Times New Roman" w:hAnsi="Times New Roman" w:cs="Times New Roman"/>
-        </w:rPr>
-        <w:t xml:space="preserve"> spike cao </w:t>
-      </w:r>
-      <w:r>
-        <w:rPr>
-          <w:rFonts w:ascii="Times New Roman" w:hAnsi="Times New Roman" w:cs="Times New Roman"/>
-        </w:rPr>
-        <w:t xml:space="preserve">thậm chí cao đột biến lên tới 9x10^6(ns). </w:t>
-      </w:r>
-      <w:r>
-        <w:rPr>
-          <w:rFonts w:ascii="Times New Roman" w:hAnsi="Times New Roman" w:cs="Times New Roman"/>
-        </w:rPr>
-        <w:t>Nhưng nhìn chung biểu đồ giá trị interval khá ổn định</w:t>
-      </w:r>
-      <w:r>
-        <w:rPr>
-          <w:rFonts w:ascii="Times New Roman" w:hAnsi="Times New Roman" w:cs="Times New Roman"/>
-        </w:rPr>
-        <w:t xml:space="preserve"> ở mức giá trị 1.1x10^6(ns)</w:t>
-      </w:r>
-      <w:r>
-        <w:rPr>
-          <w:rFonts w:ascii="Times New Roman" w:hAnsi="Times New Roman" w:cs="Times New Roman"/>
-        </w:rPr>
-        <w:t>.</w:t>
-      </w:r>
-    </w:p>
-    <w:p>
-      <w:pPr>
-        <w:jc w:val="center"/>
-        <w:rPr>
-          <w:rFonts w:ascii="Times New Roman" w:hAnsi="Times New Roman" w:cs="Times New Roman"/>
-        </w:rPr>
-      </w:pPr>
-      <w:r>
-        <w:rPr>
-          <w:rFonts w:ascii="Times New Roman" w:hAnsi="Times New Roman" w:cs="Times New Roman"/>
-          <w:noProof/>
-        </w:rPr>
-        <w:lastRenderedPageBreak/>
+        <w:t>Biểu đồ giá trị Interval với chu kỳ X = 10^3(ns)</w:t>
+      </w:r>
+    </w:p>
+    <w:p>
+      <w:pPr>
+        <w:jc w:val="center"/>
+        <w:rPr>
+          <w:rFonts w:ascii="Times New Roman" w:hAnsi="Times New Roman" w:cs="Times New Roman"/>
+        </w:rPr>
+      </w:pPr>
+      <w:r>
+        <w:rPr>
+          <w:rFonts w:ascii="Times New Roman" w:hAnsi="Times New Roman" w:cs="Times New Roman"/>
+        </w:rPr>
         <w:drawing>
-          <wp:inline distT="0" distB="0" distL="0" distR="0" wp14:anchorId="201A5971" wp14:editId="3C20569A">
-            <wp:extent cx="4892884" cy="4160520"/>
-            <wp:effectExtent l="0" t="0" r="3175" b="0"/>
-            <wp:docPr id="9" name="Picture 9"/>
+          <wp:inline distT="0" distB="0" distL="0" distR="0" wp14:anchorId="6C56C543" wp14:editId="7DCCDCDC">
+            <wp:extent cx="4587240" cy="3366988"/>
+            <wp:effectExtent l="0" t="0" r="3810" b="5080"/>
+            <wp:docPr id="6" name="Picture 6"/>
             <wp:cNvGraphicFramePr>
               <a:graphicFrameLocks xmlns:a="http://schemas.openxmlformats.org/drawingml/2006/main" noChangeAspect="1"/>
             </wp:cNvGraphicFramePr>
@@ -487,7 +328,7 @@
                   <pic:spPr>
                     <a:xfrm>
                       <a:off x="0" y="0"/>
-                      <a:ext cx="4897485" cy="4164432"/>
+                      <a:ext cx="4600223" cy="3376518"/>
                     </a:xfrm>
                     <a:prstGeom prst="rect">
                       <a:avLst/>
@@ -511,102 +352,6 @@
         <w:rPr>
           <w:rFonts w:ascii="Times New Roman" w:hAnsi="Times New Roman" w:cs="Times New Roman"/>
         </w:rPr>
-        <w:t>Biểu đồ giá trị Interval với chu kỳ X = 10^3(ns)</w:t>
-      </w:r>
-    </w:p>
-    <w:p>
-      <w:pPr>
-        <w:rPr>
-          <w:rFonts w:ascii="Times New Roman" w:hAnsi="Times New Roman" w:cs="Times New Roman"/>
-        </w:rPr>
-      </w:pPr>
-    </w:p>
-    <w:p>
-      <w:pPr>
-        <w:rPr>
-          <w:rFonts w:ascii="Times New Roman" w:hAnsi="Times New Roman" w:cs="Times New Roman"/>
-        </w:rPr>
-      </w:pPr>
-      <w:r>
-        <w:rPr>
-          <w:rFonts w:ascii="Times New Roman" w:hAnsi="Times New Roman" w:cs="Times New Roman"/>
-        </w:rPr>
-        <w:t>Đánh giá:</w:t>
-      </w:r>
-      <w:r>
-        <w:rPr>
-          <w:rFonts w:ascii="Times New Roman" w:hAnsi="Times New Roman" w:cs="Times New Roman"/>
-        </w:rPr>
-        <w:t xml:space="preserve"> Đồ thị </w:t>
-      </w:r>
-      <w:r>
-        <w:rPr>
-          <w:rFonts w:ascii="Times New Roman" w:hAnsi="Times New Roman" w:cs="Times New Roman"/>
-        </w:rPr>
-        <w:t>có giá trị phổ biến là 2x10^5(ns), cùng với đó là một vài sỉnh spike với giá trị khoảng 1.1x10^6(ns). Điều đó cho thấy với chu kỳ X = 10^3(ns) đã giảm được interval đi so với các chu kỳ X lớn hơn trước đó, tuy nhiên giá trị interval lại vẫn chưa được như mong đợi theo giá trị của chu kỳ X.</w:t>
-      </w:r>
-    </w:p>
-    <w:p>
-      <w:pPr>
-        <w:jc w:val="center"/>
-        <w:rPr>
-          <w:rFonts w:ascii="Times New Roman" w:hAnsi="Times New Roman" w:cs="Times New Roman"/>
-        </w:rPr>
-      </w:pPr>
-      <w:r>
-        <w:rPr>
-          <w:rFonts w:ascii="Times New Roman" w:hAnsi="Times New Roman" w:cs="Times New Roman"/>
-          <w:noProof/>
-        </w:rPr>
-        <w:lastRenderedPageBreak/>
-        <w:drawing>
-          <wp:inline distT="0" distB="0" distL="0" distR="0" wp14:anchorId="449CBD2C" wp14:editId="6C48B195">
-            <wp:extent cx="4351020" cy="3266879"/>
-            <wp:effectExtent l="0" t="0" r="0" b="0"/>
-            <wp:docPr id="10" name="Picture 10"/>
-            <wp:cNvGraphicFramePr>
-              <a:graphicFrameLocks xmlns:a="http://schemas.openxmlformats.org/drawingml/2006/main" noChangeAspect="1"/>
-            </wp:cNvGraphicFramePr>
-            <a:graphic xmlns:a="http://schemas.openxmlformats.org/drawingml/2006/main">
-              <a:graphicData uri="http://schemas.openxmlformats.org/drawingml/2006/picture">
-                <pic:pic xmlns:pic="http://schemas.openxmlformats.org/drawingml/2006/picture">
-                  <pic:nvPicPr>
-                    <pic:cNvPr id="1" name=""/>
-                    <pic:cNvPicPr/>
-                  </pic:nvPicPr>
-                  <pic:blipFill>
-                    <a:blip r:embed="rId9"/>
-                    <a:stretch>
-                      <a:fillRect/>
-                    </a:stretch>
-                  </pic:blipFill>
-                  <pic:spPr>
-                    <a:xfrm>
-                      <a:off x="0" y="0"/>
-                      <a:ext cx="4360326" cy="3273866"/>
-                    </a:xfrm>
-                    <a:prstGeom prst="rect">
-                      <a:avLst/>
-                    </a:prstGeom>
-                  </pic:spPr>
-                </pic:pic>
-              </a:graphicData>
-            </a:graphic>
-          </wp:inline>
-        </w:drawing>
-      </w:r>
-    </w:p>
-    <w:p>
-      <w:pPr>
-        <w:jc w:val="center"/>
-        <w:rPr>
-          <w:rFonts w:ascii="Times New Roman" w:hAnsi="Times New Roman" w:cs="Times New Roman"/>
-        </w:rPr>
-      </w:pPr>
-      <w:r>
-        <w:rPr>
-          <w:rFonts w:ascii="Times New Roman" w:hAnsi="Times New Roman" w:cs="Times New Roman"/>
-        </w:rPr>
         <w:t>Biểu đồ giá trị Interval với chu kỳ</w:t>
       </w:r>
       <w:r>
@@ -620,43 +365,6 @@
           <w:rFonts w:ascii="Times New Roman" w:hAnsi="Times New Roman" w:cs="Times New Roman"/>
         </w:rPr>
         <w:t>(ns)</w:t>
-      </w:r>
-    </w:p>
-    <w:p>
-      <w:pPr>
-        <w:rPr>
-          <w:rFonts w:ascii="Times New Roman" w:hAnsi="Times New Roman" w:cs="Times New Roman"/>
-        </w:rPr>
-      </w:pPr>
-      <w:r>
-        <w:rPr>
-          <w:rFonts w:ascii="Times New Roman" w:hAnsi="Times New Roman" w:cs="Times New Roman"/>
-        </w:rPr>
-        <w:t>Đánh giá:</w:t>
-      </w:r>
-      <w:r>
-        <w:rPr>
-          <w:rFonts w:ascii="Times New Roman" w:hAnsi="Times New Roman" w:cs="Times New Roman"/>
-        </w:rPr>
-        <w:t xml:space="preserve"> Đồ thị có </w:t>
-      </w:r>
-      <w:r>
-        <w:rPr>
-          <w:rFonts w:ascii="Times New Roman" w:hAnsi="Times New Roman" w:cs="Times New Roman"/>
-        </w:rPr>
-        <w:t xml:space="preserve">khoảng </w:t>
-      </w:r>
-      <w:r>
-        <w:rPr>
-          <w:rFonts w:ascii="Times New Roman" w:hAnsi="Times New Roman" w:cs="Times New Roman"/>
-        </w:rPr>
-        <w:t>giá trị phổ biế</w:t>
-      </w:r>
-      <w:r>
-        <w:rPr>
-          <w:rFonts w:ascii="Times New Roman" w:hAnsi="Times New Roman" w:cs="Times New Roman"/>
-        </w:rPr>
-        <w:t>n là 1.2x10^5(ns) đến 2x10^5(ns), cùng với đó là một vài spike có giá trị 10^6(ns). Điều này cho thấy việc giảm chu kỳ X từ 10^3(ns) về 10^2(ns) có làm thay đổi giá trị của interval, tuy nhiên khoảng giá trị của interval vẫn nằm trong khoảng 10^5(ns).</w:t>
       </w:r>
     </w:p>
     <w:p>
@@ -682,6 +390,7 @@
       <w:pPr>
         <w:rPr>
           <w:rFonts w:ascii="Times New Roman" w:hAnsi="Times New Roman" w:cs="Times New Roman"/>
+          <w:i/>
           <w:sz w:val="28"/>
           <w:szCs w:val="28"/>
         </w:rPr>
@@ -692,48 +401,51 @@
           <w:sz w:val="28"/>
           <w:szCs w:val="28"/>
         </w:rPr>
-        <w:t xml:space="preserve">- Với chu kỳ X </w:t>
-      </w:r>
-      <w:r>
-        <w:rPr>
-          <w:rFonts w:ascii="Times New Roman" w:hAnsi="Times New Roman" w:cs="Times New Roman"/>
+        <w:t xml:space="preserve">- Hệ thống đã hoạt động chính xác 100% việc lấy mẫu theo chu kỳ X, điều này được dẫn đến từ việc xử dụng </w:t>
+      </w:r>
+      <w:r>
+        <w:rPr>
+          <w:rFonts w:ascii="Times New Roman" w:hAnsi="Times New Roman" w:cs="Times New Roman"/>
+          <w:i/>
           <w:sz w:val="28"/>
           <w:szCs w:val="28"/>
         </w:rPr>
-        <w:t>giảm dần thì hệ thống cho ra khoảng giá trị của interval giảm dần đi, tuy nhiên giá trị của chu kỳ X vẫn lớn hơn rất nhiều so với giá trị của interval.</w:t>
-      </w:r>
-    </w:p>
-    <w:p>
-      <w:pPr>
+        <w:t>clock_nanosleep()</w:t>
+      </w:r>
+      <w:r>
         <w:rPr>
           <w:rFonts w:ascii="Times New Roman" w:hAnsi="Times New Roman" w:cs="Times New Roman"/>
           <w:sz w:val="28"/>
           <w:szCs w:val="28"/>
         </w:rPr>
-      </w:pPr>
-      <w:r>
-        <w:rPr>
-          <w:rFonts w:ascii="Times New Roman" w:hAnsi="Times New Roman" w:cs="Times New Roman"/>
+        <w:t xml:space="preserve">, hàm này cho phép ta thực hiện việc sleep với độ phân giải cao, từ đó đảm bảo độ chính xác với đơn vị thời gian nano tốt hơn </w:t>
+      </w:r>
+      <w:r>
+        <w:rPr>
+          <w:rFonts w:ascii="Times New Roman" w:hAnsi="Times New Roman" w:cs="Times New Roman"/>
+          <w:i/>
           <w:sz w:val="28"/>
           <w:szCs w:val="28"/>
         </w:rPr>
-        <w:t>- Việc interval gần như giữ giá trị ở khoảng 1.2x10^6(ns)</w:t>
-      </w:r>
-      <w:r>
+        <w:t>nano_sleep()</w:t>
+      </w:r>
+    </w:p>
+    <w:p>
+      <w:pPr>
         <w:rPr>
           <w:rFonts w:ascii="Times New Roman" w:hAnsi="Times New Roman" w:cs="Times New Roman"/>
           <w:sz w:val="28"/>
           <w:szCs w:val="28"/>
         </w:rPr>
-        <w:t xml:space="preserve"> hay từ 1.2x10^5(ns) đến 2x10^5(ns)</w:t>
-      </w:r>
+      </w:pPr>
       <w:r>
         <w:rPr>
           <w:rFonts w:ascii="Times New Roman" w:hAnsi="Times New Roman" w:cs="Times New Roman"/>
           <w:sz w:val="28"/>
           <w:szCs w:val="28"/>
         </w:rPr>
-        <w:t xml:space="preserve"> mà không phụ thuộc chu kỳ lấy mẫu, nguyên nhân có thể là do việc </w:t>
+        <w:lastRenderedPageBreak/>
+        <w:t xml:space="preserve">- </w:t>
       </w:r>
       <w:r>
         <w:rPr>
@@ -741,7 +453,26 @@
           <w:sz w:val="28"/>
           <w:szCs w:val="28"/>
         </w:rPr>
-        <w:t xml:space="preserve">sử dụng mutex để lock dữ liệu, với chu kỳ X càng nhỏ thì thời gian xử lý lại càng nhanh mà lượng câu lệnh vẫn như cũ làm cho việc lấy mẫu không thể đúng như mong đợi. </w:t>
+        <w:t>Đồng thời thay vì việc ghi dữ liệu liên tục qua I/O và việc bắn signal (cond_variable) liên tục để ghi dữ liệu. Ta sẽ sử dụng 1 buffer dùng chung cho việc ghi dữ liệu từ thread sampling, khi ghi đầy dữ liệu trong buffer hoặc sang chu kỳ X mới thì khi đó ta mới thực hiện ghi dữ liệu vào trong thread logging. Từ đó giảm nhiều việc đọc ghi I/O không cần thiết và việc bắn signal và chờ đợi signal.</w:t>
+      </w:r>
+      <w:bookmarkStart w:id="0" w:name="_GoBack"/>
+      <w:bookmarkEnd w:id="0"/>
+    </w:p>
+    <w:p>
+      <w:pPr>
+        <w:rPr>
+          <w:rFonts w:ascii="Times New Roman" w:hAnsi="Times New Roman" w:cs="Times New Roman"/>
+          <w:sz w:val="28"/>
+          <w:szCs w:val="28"/>
+        </w:rPr>
+      </w:pPr>
+      <w:r>
+        <w:rPr>
+          <w:rFonts w:ascii="Times New Roman" w:hAnsi="Times New Roman" w:cs="Times New Roman"/>
+          <w:sz w:val="28"/>
+          <w:szCs w:val="28"/>
+        </w:rPr>
+        <w:t xml:space="preserve"> </w:t>
       </w:r>
     </w:p>
     <w:sectPr>

</xml_diff>